<commit_message>
Rename the public project to NexClamp (D-057)
Package and command are now nexclamp; neuraxis and neurosem remain working import
aliases and console scripts. Env prefix NEXCLAMP_ with both legacy prefixes as
fallbacks. README, CITATION.cff, .zenodo.json and the manuscript use NexClamp, and
the manuscript now names the software (it was unnamed).

NOT renamed, deliberately: the frozen configs and every sealed campaign still record
project_name Neuraxis and the pre-rename module paths. Those files are hash-locked
evidence of what ran; FROZEN.lock still verifies. The agent-policy check accepts the
harness module under any of its historical package paths for the same reason.

1004 passed, 1 skipped.

Co-Authored-By: Claude Opus 5 <noreply@anthropic.com>
</commit_message>
<xml_diff>
--- a/docs/manuscript/MANUSCRIPT_v0.1.docx
+++ b/docs/manuscript/MANUSCRIPT_v0.1.docx
@@ -1892,7 +1892,25 @@
           <w:sz w:val="22"/>
           <w:szCs w:val="22"/>
         </w:rPr>
-        <w:t xml:space="preserve">Simulations used jNeuroML 0.14.0 and jLEMS 0.12.0 on Temurin JDK 21.0.12.1+1, with Python 3.12.10, pyNeuroML 1.3.22, libNeuroML 0.6.7 and eFEL 5.7.34, on 12 parallel workers. Every run is stored write-once under a content-addressed identifier, with its inputs, software versions and outputs. The held-out campaign was archived and sealed after completion (17,424 files, each with a SHA-256 checksum), and the pipeline refuses to write into a sealed campaign.</w:t>
+        <w:t xml:space="preserve">The method is implemented in </w:t>
+      </w:r>
+      <w:r>
+        <w:rPr>
+          <w:rFonts w:ascii="Times New Roman" w:cs="Times New Roman" w:eastAsia="Times New Roman" w:hAnsi="Times New Roman"/>
+          <w:b/>
+          <w:bCs/>
+          <w:sz w:val="22"/>
+          <w:szCs w:val="22"/>
+        </w:rPr>
+        <w:t xml:space="preserve">NexClamp</w:t>
+      </w:r>
+      <w:r>
+        <w:rPr>
+          <w:rFonts w:ascii="Times New Roman" w:cs="Times New Roman" w:eastAsia="Times New Roman" w:hAnsi="Times New Roman"/>
+          <w:sz w:val="22"/>
+          <w:szCs w:val="22"/>
+        </w:rPr>
+        <w:t xml:space="preserve">, an open-source Python package (Apache-2.0) that runs the protocols, extracts the features, calibrates the tolerances, generates the faults and controls, selects the battery and seals each campaign. Simulations used jNeuroML 0.14.0 and jLEMS 0.12.0 on Temurin JDK 21.0.12.1+1, with Python 3.12.10, pyNeuroML 1.3.22, libNeuroML 0.6.7 and eFEL 5.7.34, on 12 parallel workers. Every run is stored write-once under a content-addressed identifier, with its inputs, software versions and outputs. The held-out campaign was archived and sealed after completion (17,424 files, each with a SHA-256 checksum), and the pipeline refuses to write into a sealed campaign.</w:t>
       </w:r>
     </w:p>
     <w:p>
@@ -4556,6 +4574,51 @@
     </w:p>
     <w:p>
       <w:pPr>
+        <w:pStyle w:val="Heading2"/>
+        <w:spacing w:after="120" w:before="240"/>
+      </w:pPr>
+      <w:r>
+        <w:rPr>
+          <w:rFonts w:ascii="Times New Roman" w:cs="Times New Roman" w:eastAsia="Times New Roman" w:hAnsi="Times New Roman"/>
+          <w:b/>
+          <w:bCs/>
+          <w:sz w:val="24"/>
+          <w:szCs w:val="24"/>
+        </w:rPr>
+        <w:t xml:space="preserve">3.7 Cross-simulator check (exploratory)</w:t>
+      </w:r>
+    </w:p>
+    <w:p>
+      <w:pPr>
+        <w:spacing w:after="120" w:line="360"/>
+      </w:pPr>
+      <w:r>
+        <w:rPr>
+          <w:rFonts w:ascii="Times New Roman" w:cs="Times New Roman" w:eastAsia="Times New Roman" w:hAnsi="Times New Roman"/>
+          <w:sz w:val="22"/>
+          <w:szCs w:val="22"/>
+        </w:rPr>
+        <w:t xml:space="preserve">The evaluation used one simulator. To test whether its reference behaviour is simulator-specific, each held-out model was exported to NEURON with </w:t>
+      </w:r>
+      <w:r>
+        <w:rPr>
+          <w:rFonts w:ascii="Consolas" w:cs="Consolas" w:eastAsia="Consolas" w:hAnsi="Consolas"/>
+          <w:sz w:val="20"/>
+          <w:szCs w:val="20"/>
+        </w:rPr>
+        <w:t xml:space="preserve">jnml -neuron</w:t>
+      </w:r>
+      <w:r>
+        <w:rPr>
+          <w:rFonts w:ascii="Times New Roman" w:cs="Times New Roman" w:eastAsia="Times New Roman" w:hAnsi="Times New Roman"/>
+          <w:sz w:val="22"/>
+          <w:szCs w:val="22"/>
+        </w:rPr>
+        <w:t xml:space="preserve"> and its canonical simulation re-run under NEURON 9.0.2. All six models exported, compiled and ran. Spike counts were identical in every case (7, 5, 9, 4, 7 and 4 spikes), and matched each model's own published NEURON reference. The largest difference in any spike time was 0.009 to 0.182 ms, and whole-trace differences were 0.19 to 2.18 mV RMS, consistent with two integrators rather than two behaviours. This check was added after the confirmatory run, is exploratory, and is reported descriptively: the study's tolerances are calibrated within one integrator and do not transfer across two. It supports the reference simulations the detections are measured against; it does not re-test the faults.</w:t>
+      </w:r>
+    </w:p>
+    <w:p>
+      <w:pPr>
         <w:pStyle w:val="Heading1"/>
         <w:spacing w:after="160" w:before="360"/>
       </w:pPr>
@@ -4648,7 +4711,7 @@
           <w:sz w:val="22"/>
           <w:szCs w:val="22"/>
         </w:rPr>
-        <w:t xml:space="preserve">The evaluation used six models from four source families, so intervals are wide and the model-level permutation test is underpowered by construction; the interval for Δ excludes zero but does not establish a material advantage. All models are single-compartment and were simulated with one simulator; dendritic faults and simulator-specific numerics were out of scope. Faults were synthetic single-site edits; real modification errors may be larger, compound or correlated. Admissibility depends on the definition used (82 by feature classification, 94 including trace-only changes). The result for the held-out kinetics family is inconclusive. The frozen generator produced 186 variants, above the preregistered estimate of roughly 100 to 150, and selection produced a three-protocol battery under a four-protocol budget; both are reported as they occurred. An automated re-check of the 26 audited faults (a random sample of 20 and the six canonical survivors) found every edit, class and detection consistent with the raw model files and voltage traces; the independent human audit of the same faults is [pending].</w:t>
+        <w:t xml:space="preserve">The evaluation used six models from four source families, so intervals are wide and the model-level permutation test is underpowered by construction; the interval for Δ excludes zero but does not establish a material advantage. All models are single-compartment. The faults themselves were evaluated in one simulator, although every held-out model's reference behaviour reproduced in NEURON (section 3.7); dendritic faults remain out of scope. Faults were synthetic single-site edits; real modification errors may be larger, compound or correlated. Admissibility depends on the definition used (82 by feature classification, 94 including trace-only changes). The result for the held-out kinetics family is inconclusive. The frozen generator produced 186 variants, above the preregistered estimate of roughly 100 to 150, and selection produced a three-protocol battery under a four-protocol budget; both are reported as they occurred. An automated re-check of the 26 audited faults (a random sample of 20 and the six canonical survivors) found every edit, class and detection consistent with the raw model files and voltage traces; the independent human audit of the same faults is [pending].</w:t>
       </w:r>
     </w:p>
     <w:p>
@@ -4735,7 +4798,7 @@
           <w:sz w:val="22"/>
           <w:szCs w:val="22"/>
         </w:rPr>
-        <w:t xml:space="preserve">The code, frozen configuration, model snapshots (with licences), all per-variant records and summary tables, and the scripts that produce every number and figure in this article are available at [repository URL] and archived at Zenodo [DOI]. Raw voltage traces (4.5 GB) are archived at [location]. The preregistration is available at https://aspredicted.org/q2ag7w.pdf. All models are third-party open-source NeuroML models, used under their licences (Online Resource 1).</w:t>
+        <w:t xml:space="preserve">NexClamp, the frozen configuration, model snapshots (with licences), all per-variant records and summary tables, and the scripts that produce every number and figure in this article are available at [repository URL] and archived at Zenodo [DOI]. Raw voltage traces (4.5 GB) are archived at [location]. The preregistration is available at https://aspredicted.org/q2ag7w.pdf. All models are third-party open-source NeuroML models, used under their licences (Online Resource 1).</w:t>
       </w:r>
     </w:p>
     <w:p>
@@ -5279,33 +5342,33 @@
           <w:sz w:val="22"/>
           <w:szCs w:val="22"/>
         </w:rPr>
-        <w:t xml:space="preserve">Appukuttan S, Davison AP (2022) Reproducing and quantitatively validating a biologically-constrained point-neuron model of CA1 pyramidal cells. Front Integr Neurosci. https://doi.org/10.3389/fnint.2022.1041423</w:t>
-      </w:r>
-    </w:p>
-    <w:p>
-      <w:pPr>
-        <w:spacing w:after="120" w:line="360"/>
-      </w:pPr>
-      <w:r>
-        <w:rPr>
-          <w:rFonts w:ascii="Times New Roman" w:cs="Times New Roman" w:eastAsia="Times New Roman" w:hAnsi="Times New Roman"/>
-          <w:sz w:val="22"/>
-          <w:szCs w:val="22"/>
-        </w:rPr>
-        <w:t xml:space="preserve">Birgiolas J, Haynes V, Gleeson P, Gerkin RC, Dietrich SW, Crook S (2023) NeuroML-DB: Sharing and characterizing data-driven neuroscience models described in NeuroML. PLoS Comput Biol. https://doi.org/10.1371/journal.pcbi.1010941</w:t>
-      </w:r>
-    </w:p>
-    <w:p>
-      <w:pPr>
-        <w:spacing w:after="120" w:line="360"/>
-      </w:pPr>
-      <w:r>
-        <w:rPr>
-          <w:rFonts w:ascii="Times New Roman" w:cs="Times New Roman" w:eastAsia="Times New Roman" w:hAnsi="Times New Roman"/>
-          <w:sz w:val="22"/>
-          <w:szCs w:val="22"/>
-        </w:rPr>
-        <w:t xml:space="preserve">Druckmann S, Berger TK, Schürmann F, Hill S, Markram H, Segev I (2011) Effective stimuli for constructing reliable neuron models. PLoS Comput Biol. https://doi.org/10.1371/journal.pcbi.1002133</w:t>
+        <w:t xml:space="preserve">Appukuttan S, Davison AP (2022) Reproducing and quantitatively validating a biologically-constrained point-neuron model of CA1 pyramidal cells. Frontiers in Integrative Neuroscience 16. https://doi.org/10.3389/fnint.2022.1041423</w:t>
+      </w:r>
+    </w:p>
+    <w:p>
+      <w:pPr>
+        <w:spacing w:after="120" w:line="360"/>
+      </w:pPr>
+      <w:r>
+        <w:rPr>
+          <w:rFonts w:ascii="Times New Roman" w:cs="Times New Roman" w:eastAsia="Times New Roman" w:hAnsi="Times New Roman"/>
+          <w:sz w:val="22"/>
+          <w:szCs w:val="22"/>
+        </w:rPr>
+        <w:t xml:space="preserve">Birgiolas J, Haynes V, Gleeson P, Gerkin RC, Dietrich SW, Crook S (2023) NeuroML-DB: Sharing and characterizing data-driven neuroscience models described in NeuroML. PLOS Computational Biology 19:e1010941. https://doi.org/10.1371/journal.pcbi.1010941</w:t>
+      </w:r>
+    </w:p>
+    <w:p>
+      <w:pPr>
+        <w:spacing w:after="120" w:line="360"/>
+      </w:pPr>
+      <w:r>
+        <w:rPr>
+          <w:rFonts w:ascii="Times New Roman" w:cs="Times New Roman" w:eastAsia="Times New Roman" w:hAnsi="Times New Roman"/>
+          <w:sz w:val="22"/>
+          <w:szCs w:val="22"/>
+        </w:rPr>
+        <w:t xml:space="preserve">Druckmann S, Berger TK, Schürmann F, Hill S, Markram H, Segev I (2011) Effective stimuli for constructing reliable neuron models. PLoS Computational Biology 7:e1002133. https://doi.org/10.1371/journal.pcbi.1002133</w:t>
       </w:r>
     </w:p>
     <w:p>
@@ -5331,46 +5394,46 @@
           <w:sz w:val="22"/>
           <w:szCs w:val="22"/>
         </w:rPr>
-        <w:t xml:space="preserve">Hay E, Hill S, Schürmann F, Markram H, Segev I (2011) Models of neocortical layer 5b pyramidal cells capturing a wide range of dendritic and perisomatic active properties. PLoS Comput Biol 7:e1002107. https://doi.org/10.1371/journal.pcbi.1002107</w:t>
-      </w:r>
-    </w:p>
-    <w:p>
-      <w:pPr>
-        <w:spacing w:after="120" w:line="360"/>
-      </w:pPr>
-      <w:r>
-        <w:rPr>
-          <w:rFonts w:ascii="Times New Roman" w:cs="Times New Roman" w:eastAsia="Times New Roman" w:hAnsi="Times New Roman"/>
-          <w:sz w:val="22"/>
-          <w:szCs w:val="22"/>
-        </w:rPr>
-        <w:t xml:space="preserve">Hook D, Kelly D (2009) Mutation sensitivity testing. Comput Sci Eng. https://doi.org/10.1109/MCSE.2009.200</w:t>
-      </w:r>
-    </w:p>
-    <w:p>
-      <w:pPr>
-        <w:spacing w:after="120" w:line="360"/>
-      </w:pPr>
-      <w:r>
-        <w:rPr>
-          <w:rFonts w:ascii="Times New Roman" w:cs="Times New Roman" w:eastAsia="Times New Roman" w:hAnsi="Times New Roman"/>
-          <w:sz w:val="22"/>
-          <w:szCs w:val="22"/>
-        </w:rPr>
-        <w:t xml:space="preserve">Kelly D, Gray R, Shao Y (2011) Examining random and designed tests to detect code mistakes in scientific software. J Comput Sci. https://doi.org/10.1016/j.jocs.2010.12.002</w:t>
-      </w:r>
-    </w:p>
-    <w:p>
-      <w:pPr>
-        <w:spacing w:after="120" w:line="360"/>
-      </w:pPr>
-      <w:r>
-        <w:rPr>
-          <w:rFonts w:ascii="Times New Roman" w:cs="Times New Roman" w:eastAsia="Times New Roman" w:hAnsi="Times New Roman"/>
-          <w:sz w:val="22"/>
-          <w:szCs w:val="22"/>
-        </w:rPr>
-        <w:t xml:space="preserve">Mandge D, Tuncel A, Jaquier A, Kilic I, Damart T, et al. (2026) eFEL: electrophysiology feature extraction library. Bioinformatics. https://doi.org/10.1093/bioinformatics/btag328</w:t>
+        <w:t xml:space="preserve">Hay E, Hill S, Schürmann F, Markram H, Segev I (2011) Models of neocortical layer 5b pyramidal cells capturing a wide range of dendritic and perisomatic active properties. PLoS Computational Biology 7:e1002107. https://doi.org/10.1371/journal.pcbi.1002107</w:t>
+      </w:r>
+    </w:p>
+    <w:p>
+      <w:pPr>
+        <w:spacing w:after="120" w:line="360"/>
+      </w:pPr>
+      <w:r>
+        <w:rPr>
+          <w:rFonts w:ascii="Times New Roman" w:cs="Times New Roman" w:eastAsia="Times New Roman" w:hAnsi="Times New Roman"/>
+          <w:sz w:val="22"/>
+          <w:szCs w:val="22"/>
+        </w:rPr>
+        <w:t xml:space="preserve">Hook D, Kelly D (2009) Mutation sensitivity testing. Computing in Science &amp; Engineering 11:40-47. https://doi.org/10.1109/MCSE.2009.200</w:t>
+      </w:r>
+    </w:p>
+    <w:p>
+      <w:pPr>
+        <w:spacing w:after="120" w:line="360"/>
+      </w:pPr>
+      <w:r>
+        <w:rPr>
+          <w:rFonts w:ascii="Times New Roman" w:cs="Times New Roman" w:eastAsia="Times New Roman" w:hAnsi="Times New Roman"/>
+          <w:sz w:val="22"/>
+          <w:szCs w:val="22"/>
+        </w:rPr>
+        <w:t xml:space="preserve">Kelly D, Gray R, Shao Y (2011) Examining random and designed tests to detect code mistakes in scientific software. Journal of Computational Science 2:47-56. https://doi.org/10.1016/j.jocs.2010.12.002</w:t>
+      </w:r>
+    </w:p>
+    <w:p>
+      <w:pPr>
+        <w:spacing w:after="120" w:line="360"/>
+      </w:pPr>
+      <w:r>
+        <w:rPr>
+          <w:rFonts w:ascii="Times New Roman" w:cs="Times New Roman" w:eastAsia="Times New Roman" w:hAnsi="Times New Roman"/>
+          <w:sz w:val="22"/>
+          <w:szCs w:val="22"/>
+        </w:rPr>
+        <w:t xml:space="preserve">Mandge D, Tuncel A, Jaquier A, Kilic I, Damart T, et al. (2026) eFEL: electrophysiology feature extraction library. Bioinformatics 42. https://doi.org/10.1093/bioinformatics/btag328</w:t>
       </w:r>
     </w:p>
     <w:p>
@@ -5396,163 +5459,163 @@
           <w:sz w:val="22"/>
           <w:szCs w:val="22"/>
         </w:rPr>
-        <w:t xml:space="preserve">Markram H, Muller E, Ramaswamy S, Reimann MW, et al. (2015) Reconstruction and simulation of neocortical microcircuitry. Cell 163:456–492. https://doi.org/10.1016/j.cell.2015.09.029</w:t>
-      </w:r>
-    </w:p>
-    <w:p>
-      <w:pPr>
-        <w:spacing w:after="120" w:line="360"/>
-      </w:pPr>
-      <w:r>
-        <w:rPr>
-          <w:rFonts w:ascii="Times New Roman" w:cs="Times New Roman" w:eastAsia="Times New Roman" w:hAnsi="Times New Roman"/>
-          <w:sz w:val="22"/>
-          <w:szCs w:val="22"/>
-        </w:rPr>
-        <w:t xml:space="preserve">Matinnejad R, Nejati S, Briand LC, Bruckmann T (2019) Test generation and test prioritization for Simulink models with dynamic behavior. IEEE Trans Softw Eng. https://doi.org/10.1109/TSE.2018.2811489</w:t>
-      </w:r>
-    </w:p>
-    <w:p>
-      <w:pPr>
-        <w:spacing w:after="120" w:line="360"/>
-      </w:pPr>
-      <w:r>
-        <w:rPr>
-          <w:rFonts w:ascii="Times New Roman" w:cs="Times New Roman" w:eastAsia="Times New Roman" w:hAnsi="Times New Roman"/>
-          <w:sz w:val="22"/>
-          <w:szCs w:val="22"/>
-        </w:rPr>
-        <w:t xml:space="preserve">Migliore M, Ferrante M, Ascoli GA (2005) Signal propagation in oblique dendrites of CA1 pyramidal cells. J Neurophysiol 94:4145–4155. https://doi.org/10.1152/jn.00521.2005</w:t>
-      </w:r>
-    </w:p>
-    <w:p>
-      <w:pPr>
-        <w:spacing w:after="120" w:line="360"/>
-      </w:pPr>
-      <w:r>
-        <w:rPr>
-          <w:rFonts w:ascii="Times New Roman" w:cs="Times New Roman" w:eastAsia="Times New Roman" w:hAnsi="Times New Roman"/>
-          <w:sz w:val="22"/>
-          <w:szCs w:val="22"/>
-        </w:rPr>
-        <w:t xml:space="preserve">Papadakis M, Kintis M, Zhang J, Jia Y, Le Traon Y, Harman M (2019) Mutation testing advances: an analysis and survey. Adv Comput. https://doi.org/10.1016/bs.adcom.2018.03.015</w:t>
-      </w:r>
-    </w:p>
-    <w:p>
-      <w:pPr>
-        <w:spacing w:after="120" w:line="360"/>
-      </w:pPr>
-      <w:r>
-        <w:rPr>
-          <w:rFonts w:ascii="Times New Roman" w:cs="Times New Roman" w:eastAsia="Times New Roman" w:hAnsi="Times New Roman"/>
-          <w:sz w:val="22"/>
-          <w:szCs w:val="22"/>
-        </w:rPr>
-        <w:t xml:space="preserve">Reva M, Rössert C, Arnaudon A, Damart T, Mandge D, et al. (2023) A universal workflow for creation, validation, and generalization of detailed neuronal models. Patterns. https://doi.org/10.1016/j.patter.2023.100855</w:t>
-      </w:r>
-    </w:p>
-    <w:p>
-      <w:pPr>
-        <w:spacing w:after="120" w:line="360"/>
-      </w:pPr>
-      <w:r>
-        <w:rPr>
-          <w:rFonts w:ascii="Times New Roman" w:cs="Times New Roman" w:eastAsia="Times New Roman" w:hAnsi="Times New Roman"/>
-          <w:sz w:val="22"/>
-          <w:szCs w:val="22"/>
-        </w:rPr>
-        <w:t xml:space="preserve">Sáray S, Rössert CA, Appukuttan S, et al. (2021) HippoUnit: A software tool for the automated testing and systematic comparison of detailed models of hippocampal neurons based on electrophysiological data. PLoS Comput Biol. https://doi.org/10.1371/journal.pcbi.1008114</w:t>
-      </w:r>
-    </w:p>
-    <w:p>
-      <w:pPr>
-        <w:spacing w:after="120" w:line="360"/>
-      </w:pPr>
-      <w:r>
-        <w:rPr>
-          <w:rFonts w:ascii="Times New Roman" w:cs="Times New Roman" w:eastAsia="Times New Roman" w:hAnsi="Times New Roman"/>
-          <w:sz w:val="22"/>
-          <w:szCs w:val="22"/>
-        </w:rPr>
-        <w:t xml:space="preserve">Segura S, Fraser G, Sanchez AB, Ruiz-Cortés A (2016) A survey on metamorphic testing. IEEE Trans Softw Eng. https://doi.org/10.1109/TSE.2016.2532875</w:t>
-      </w:r>
-    </w:p>
-    <w:p>
-      <w:pPr>
-        <w:spacing w:after="120" w:line="360"/>
-      </w:pPr>
-      <w:r>
-        <w:rPr>
-          <w:rFonts w:ascii="Times New Roman" w:cs="Times New Roman" w:eastAsia="Times New Roman" w:hAnsi="Times New Roman"/>
-          <w:sz w:val="22"/>
-          <w:szCs w:val="22"/>
-        </w:rPr>
-        <w:t xml:space="preserve">Sinha A, Gleeson P, Marin B, et al. (2025) The NeuroML ecosystem for standardized multi-scale modeling in neuroscience. eLife. https://doi.org/10.7554/eLife.95135</w:t>
-      </w:r>
-    </w:p>
-    <w:p>
-      <w:pPr>
-        <w:spacing w:after="120" w:line="360"/>
-      </w:pPr>
-      <w:r>
-        <w:rPr>
-          <w:rFonts w:ascii="Times New Roman" w:cs="Times New Roman" w:eastAsia="Times New Roman" w:hAnsi="Times New Roman"/>
-          <w:sz w:val="22"/>
-          <w:szCs w:val="22"/>
-        </w:rPr>
-        <w:t xml:space="preserve">Smith SL, Smith IT, Branco T, Häusser M (2013) Dendritic spikes enhance stimulus selectivity in cortical neurons in vivo. Nature 503:115–120. https://doi.org/10.1038/nature12600</w:t>
-      </w:r>
-    </w:p>
-    <w:p>
-      <w:pPr>
-        <w:spacing w:after="120" w:line="360"/>
-      </w:pPr>
-      <w:r>
-        <w:rPr>
-          <w:rFonts w:ascii="Times New Roman" w:cs="Times New Roman" w:eastAsia="Times New Roman" w:hAnsi="Times New Roman"/>
-          <w:sz w:val="22"/>
-          <w:szCs w:val="22"/>
-        </w:rPr>
-        <w:t xml:space="preserve">Traub RD, Contreras D, Cunningham MO, et al. (2005) Single-column thalamocortical network model exhibiting gamma oscillations, sleep spindles, and epileptogenic bursts. J Neurophysiol 93:2194–2232. https://doi.org/10.1152/jn.00983.2004</w:t>
-      </w:r>
-    </w:p>
-    <w:p>
-      <w:pPr>
-        <w:spacing w:after="120" w:line="360"/>
-      </w:pPr>
-      <w:r>
-        <w:rPr>
-          <w:rFonts w:ascii="Times New Roman" w:cs="Times New Roman" w:eastAsia="Times New Roman" w:hAnsi="Times New Roman"/>
-          <w:sz w:val="22"/>
-          <w:szCs w:val="22"/>
-        </w:rPr>
-        <w:t xml:space="preserve">Van Geit W, Gevaert M, Chindemi G, et al. (2016) BluePyOpt: leveraging open source software and cloud infrastructure to optimise model parameters in neuroscience. Front Neuroinform. https://doi.org/10.3389/fninf.2016.00017</w:t>
-      </w:r>
-    </w:p>
-    <w:p>
-      <w:pPr>
-        <w:spacing w:after="120" w:line="360"/>
-      </w:pPr>
-      <w:r>
-        <w:rPr>
-          <w:rFonts w:ascii="Times New Roman" w:cs="Times New Roman" w:eastAsia="Times New Roman" w:hAnsi="Times New Roman"/>
-          <w:sz w:val="22"/>
-          <w:szCs w:val="22"/>
-        </w:rPr>
-        <w:t xml:space="preserve">Yoo S, Harman M (2012) Regression testing minimization, selection and prioritization: a survey. Softw Test Verif Reliab. https://doi.org/10.1002/stvr.430</w:t>
-      </w:r>
-    </w:p>
-    <w:p>
-      <w:pPr>
-        <w:spacing w:after="120" w:line="360"/>
-      </w:pPr>
-      <w:r>
-        <w:rPr>
-          <w:rFonts w:ascii="Times New Roman" w:cs="Times New Roman" w:eastAsia="Times New Roman" w:hAnsi="Times New Roman"/>
-          <w:sz w:val="22"/>
-          <w:szCs w:val="22"/>
-        </w:rPr>
-        <w:t xml:space="preserve">Zhan Y, Clark JA (2005) Search-based mutation testing for Simulink models. Proc GECCO 2005. https://doi.org/10.1145/1068009.1068188</w:t>
+        <w:t xml:space="preserve">Markram H, Muller E, Ramaswamy S, Reimann MW, et al. (2015) Reconstruction and simulation of neocortical microcircuitry. Cell 163:456-492. https://doi.org/10.1016/j.cell.2015.09.029</w:t>
+      </w:r>
+    </w:p>
+    <w:p>
+      <w:pPr>
+        <w:spacing w:after="120" w:line="360"/>
+      </w:pPr>
+      <w:r>
+        <w:rPr>
+          <w:rFonts w:ascii="Times New Roman" w:cs="Times New Roman" w:eastAsia="Times New Roman" w:hAnsi="Times New Roman"/>
+          <w:sz w:val="22"/>
+          <w:szCs w:val="22"/>
+        </w:rPr>
+        <w:t xml:space="preserve">Matinnejad R, Nejati S, Briand LC, Bruckmann T (2019) Test generation and test prioritization for Simulink models with dynamic behavior. IEEE Transactions on Software Engineering 45:919-944. https://doi.org/10.1109/TSE.2018.2811489</w:t>
+      </w:r>
+    </w:p>
+    <w:p>
+      <w:pPr>
+        <w:spacing w:after="120" w:line="360"/>
+      </w:pPr>
+      <w:r>
+        <w:rPr>
+          <w:rFonts w:ascii="Times New Roman" w:cs="Times New Roman" w:eastAsia="Times New Roman" w:hAnsi="Times New Roman"/>
+          <w:sz w:val="22"/>
+          <w:szCs w:val="22"/>
+        </w:rPr>
+        <w:t xml:space="preserve">Migliore M, Ferrante M, Ascoli GA (2005) Signal propagation in oblique dendrites of CA1 pyramidal cells. Journal of Neurophysiology 94:4145-4155. https://doi.org/10.1152/jn.00521.2005</w:t>
+      </w:r>
+    </w:p>
+    <w:p>
+      <w:pPr>
+        <w:spacing w:after="120" w:line="360"/>
+      </w:pPr>
+      <w:r>
+        <w:rPr>
+          <w:rFonts w:ascii="Times New Roman" w:cs="Times New Roman" w:eastAsia="Times New Roman" w:hAnsi="Times New Roman"/>
+          <w:sz w:val="22"/>
+          <w:szCs w:val="22"/>
+        </w:rPr>
+        <w:t xml:space="preserve">Papadakis M, Kintis M, Zhang J, Jia Y, Le Traon Y, Harman M (2019) Mutation testing advances: an analysis and survey. Advances in Computers:275-378. https://doi.org/10.1016/bs.adcom.2018.03.015</w:t>
+      </w:r>
+    </w:p>
+    <w:p>
+      <w:pPr>
+        <w:spacing w:after="120" w:line="360"/>
+      </w:pPr>
+      <w:r>
+        <w:rPr>
+          <w:rFonts w:ascii="Times New Roman" w:cs="Times New Roman" w:eastAsia="Times New Roman" w:hAnsi="Times New Roman"/>
+          <w:sz w:val="22"/>
+          <w:szCs w:val="22"/>
+        </w:rPr>
+        <w:t xml:space="preserve">Reva M, Rössert C, Arnaudon A, Damart T, Mandge D, et al. (2023) A universal workflow for creation, validation, and generalization of detailed neuronal models. Patterns 4:100855. https://doi.org/10.1016/j.patter.2023.100855</w:t>
+      </w:r>
+    </w:p>
+    <w:p>
+      <w:pPr>
+        <w:spacing w:after="120" w:line="360"/>
+      </w:pPr>
+      <w:r>
+        <w:rPr>
+          <w:rFonts w:ascii="Times New Roman" w:cs="Times New Roman" w:eastAsia="Times New Roman" w:hAnsi="Times New Roman"/>
+          <w:sz w:val="22"/>
+          <w:szCs w:val="22"/>
+        </w:rPr>
+        <w:t xml:space="preserve">Sáray S, Rössert CA, Appukuttan S, et al. (2021) HippoUnit: A software tool for the automated testing and systematic comparison of detailed models of hippocampal neurons based on electrophysiological data. PLOS Computational Biology 17:e1008114. https://doi.org/10.1371/journal.pcbi.1008114</w:t>
+      </w:r>
+    </w:p>
+    <w:p>
+      <w:pPr>
+        <w:spacing w:after="120" w:line="360"/>
+      </w:pPr>
+      <w:r>
+        <w:rPr>
+          <w:rFonts w:ascii="Times New Roman" w:cs="Times New Roman" w:eastAsia="Times New Roman" w:hAnsi="Times New Roman"/>
+          <w:sz w:val="22"/>
+          <w:szCs w:val="22"/>
+        </w:rPr>
+        <w:t xml:space="preserve">Segura S, Fraser G, Sanchez AB, Ruiz-Cortés A (2016) A survey on metamorphic testing. IEEE Transactions on Software Engineering 42:805-824. https://doi.org/10.1109/TSE.2016.2532875</w:t>
+      </w:r>
+    </w:p>
+    <w:p>
+      <w:pPr>
+        <w:spacing w:after="120" w:line="360"/>
+      </w:pPr>
+      <w:r>
+        <w:rPr>
+          <w:rFonts w:ascii="Times New Roman" w:cs="Times New Roman" w:eastAsia="Times New Roman" w:hAnsi="Times New Roman"/>
+          <w:sz w:val="22"/>
+          <w:szCs w:val="22"/>
+        </w:rPr>
+        <w:t xml:space="preserve">Sinha A, Gleeson P, Marin B, et al. (2025) The NeuroML ecosystem for standardized multi-scale modeling in neuroscience. eLife 13. https://doi.org/10.7554/eLife.95135</w:t>
+      </w:r>
+    </w:p>
+    <w:p>
+      <w:pPr>
+        <w:spacing w:after="120" w:line="360"/>
+      </w:pPr>
+      <w:r>
+        <w:rPr>
+          <w:rFonts w:ascii="Times New Roman" w:cs="Times New Roman" w:eastAsia="Times New Roman" w:hAnsi="Times New Roman"/>
+          <w:sz w:val="22"/>
+          <w:szCs w:val="22"/>
+        </w:rPr>
+        <w:t xml:space="preserve">Smith SL, Smith IT, Branco T, Häusser M (2013) Dendritic spikes enhance stimulus selectivity in cortical neurons in vivo. Nature 503:115-120. https://doi.org/10.1038/nature12600</w:t>
+      </w:r>
+    </w:p>
+    <w:p>
+      <w:pPr>
+        <w:spacing w:after="120" w:line="360"/>
+      </w:pPr>
+      <w:r>
+        <w:rPr>
+          <w:rFonts w:ascii="Times New Roman" w:cs="Times New Roman" w:eastAsia="Times New Roman" w:hAnsi="Times New Roman"/>
+          <w:sz w:val="22"/>
+          <w:szCs w:val="22"/>
+        </w:rPr>
+        <w:t xml:space="preserve">Traub RD, Contreras D, Cunningham MO, et al. (2005) Single-column thalamocortical network model exhibiting gamma oscillations, sleep spindles, and epileptogenic bursts. Journal of Neurophysiology 93:2194-2232. https://doi.org/10.1152/jn.00983.2004</w:t>
+      </w:r>
+    </w:p>
+    <w:p>
+      <w:pPr>
+        <w:spacing w:after="120" w:line="360"/>
+      </w:pPr>
+      <w:r>
+        <w:rPr>
+          <w:rFonts w:ascii="Times New Roman" w:cs="Times New Roman" w:eastAsia="Times New Roman" w:hAnsi="Times New Roman"/>
+          <w:sz w:val="22"/>
+          <w:szCs w:val="22"/>
+        </w:rPr>
+        <w:t xml:space="preserve">Van Geit W, Gevaert M, Chindemi G, et al. (2016) BluePyOpt: leveraging open source software and cloud infrastructure to optimise model parameters in neuroscience. Frontiers in Neuroinformatics 10. https://doi.org/10.3389/fninf.2016.00017</w:t>
+      </w:r>
+    </w:p>
+    <w:p>
+      <w:pPr>
+        <w:spacing w:after="120" w:line="360"/>
+      </w:pPr>
+      <w:r>
+        <w:rPr>
+          <w:rFonts w:ascii="Times New Roman" w:cs="Times New Roman" w:eastAsia="Times New Roman" w:hAnsi="Times New Roman"/>
+          <w:sz w:val="22"/>
+          <w:szCs w:val="22"/>
+        </w:rPr>
+        <w:t xml:space="preserve">Yoo S, Harman M (2012) Regression testing minimization, selection and prioritization: a survey. Software Testing, Verification and Reliability 22:67-120. https://doi.org/10.1002/stvr.430</w:t>
+      </w:r>
+    </w:p>
+    <w:p>
+      <w:pPr>
+        <w:spacing w:after="120" w:line="360"/>
+      </w:pPr>
+      <w:r>
+        <w:rPr>
+          <w:rFonts w:ascii="Times New Roman" w:cs="Times New Roman" w:eastAsia="Times New Roman" w:hAnsi="Times New Roman"/>
+          <w:sz w:val="22"/>
+          <w:szCs w:val="22"/>
+        </w:rPr>
+        <w:t xml:space="preserve">Zhan Y, Clark JA (2005) Search-based mutation testing for Simulink models. In: Proceedings of GECCO 2005, pp 1061-1068. https://doi.org/10.1145/1068009.1068188</w:t>
       </w:r>
     </w:p>
     <w:p>
@@ -5681,34 +5744,6 @@
           <w:szCs w:val="22"/>
         </w:rPr>
         <w:t xml:space="preserve">: public repository URL, Zenodo DOI, location for the raw traces.</w:t>
-      </w:r>
-    </w:p>
-    <w:p>
-      <w:pPr>
-        <w:pStyle w:val="ListParagraph"/>
-        <w:numPr>
-          <w:ilvl w:val="0"/>
-          <w:numId w:val="3"/>
-        </w:numPr>
-        <w:spacing w:after="80" w:line="320"/>
-      </w:pPr>
-      <w:r>
-        <w:rPr>
-          <w:rFonts w:ascii="Times New Roman" w:cs="Times New Roman" w:eastAsia="Times New Roman" w:hAnsi="Times New Roman"/>
-          <w:b/>
-          <w:bCs/>
-          <w:sz w:val="22"/>
-          <w:szCs w:val="22"/>
-        </w:rPr>
-        <w:t xml:space="preserve">Tool name</w:t>
-      </w:r>
-      <w:r>
-        <w:rPr>
-          <w:rFonts w:ascii="Times New Roman" w:cs="Times New Roman" w:eastAsia="Times New Roman" w:hAnsi="Times New Roman"/>
-          <w:sz w:val="22"/>
-          <w:szCs w:val="22"/>
-        </w:rPr>
-        <w:t xml:space="preserve">: the framework is unnamed in this draft (the public name is undecided).</w:t>
       </w:r>
     </w:p>
     <w:p>

</xml_diff>